<commit_message>
Diagnostic docx: embed 9 bridge schematic images (Part A + Part C) so test is self-contained
</commit_message>
<xml_diff>
--- a/resources/Y7-TECH-T2-DIAGNOSTIC-RUBRIC.docx
+++ b/resources/Y7-TECH-T2-DIAGNOSTIC-RUBRIC.docx
@@ -277,7 +277,7 @@
           <w:i/>
           <w:sz w:val="20"/>
         </w:rPr>
-        <w:t>Prompt: Look at the bridge on the slide/page labelled A1. Circle or write: beam / arch / truss / suspension / cable-stayed.</w:t>
+        <w:t>Prompt: Look at Bridge A1 above. Circle or write one word: beam · arch · truss · suspension · cable-stayed.</w:t>
       </w:r>
     </w:p>
     <w:p>
@@ -288,7 +288,7 @@
           <w:color w:val="9A3412"/>
           <w:sz w:val="20"/>
         </w:rPr>
-        <w:t>Award full marks if: Truss (or whatever the projected photo shows — teacher configures images in advance)</w:t>
+        <w:t>Award full marks if: TRUSS (the diagonal + vertical web between two horizontal chords is a Pratt truss)</w:t>
       </w:r>
     </w:p>
     <w:p>
@@ -317,7 +317,7 @@
           <w:i/>
           <w:sz w:val="20"/>
         </w:rPr>
-        <w:t>Prompt: Bridge A2: What ONE part is pointed to with an arrow? (choose from: deck · pier · abutment · truss · cable)</w:t>
+        <w:t>Prompt: Bridge A2 above — what ONE part is the red arrow pointing to? (choose: deck · pier · abutment · truss · cable)</w:t>
       </w:r>
     </w:p>
     <w:p>
@@ -328,7 +328,7 @@
           <w:color w:val="9A3412"/>
           <w:sz w:val="20"/>
         </w:rPr>
-        <w:t>Award full marks if: Deck (top surface where the road/walkway sits)</w:t>
+        <w:t>Award full marks if: DECK (top horizontal surface — where the road or walkway sits)</w:t>
       </w:r>
     </w:p>
     <w:p>
@@ -357,7 +357,7 @@
           <w:i/>
           <w:sz w:val="20"/>
         </w:rPr>
-        <w:t>Prompt: Bridge A3: Which TWO bridge types are shown? (both pictures)</w:t>
+        <w:t>Prompt: A3 above shows TWO bridges. Which type is on the LEFT, and which type is on the RIGHT?</w:t>
       </w:r>
     </w:p>
     <w:p>
@@ -368,7 +368,7 @@
           <w:color w:val="9A3412"/>
           <w:sz w:val="20"/>
         </w:rPr>
-        <w:t>Award full marks if: Arch bridge AND suspension bridge (example — depends on teacher's photo pack)</w:t>
+        <w:t>Award full marks if: LEFT = ARCH bridge  ·  RIGHT = SUSPENSION bridge</w:t>
       </w:r>
     </w:p>
     <w:p>
@@ -407,7 +407,7 @@
           <w:i/>
           <w:sz w:val="20"/>
         </w:rPr>
-        <w:t>Prompt: Bridge A4 is a Pratt truss. Which members carry compression? Circle the members shown in red. (Or answer: 'the _______ c...</w:t>
+        <w:t>Prompt: Bridge A4 above shows a Pratt truss with members coloured RED (compression) and BLUE (tension). Name TWO types of member...</w:t>
       </w:r>
     </w:p>
     <w:p>
@@ -418,7 +418,7 @@
           <w:color w:val="9A3412"/>
           <w:sz w:val="20"/>
         </w:rPr>
-        <w:t>Award full marks if: Top chord + verticals (in Pratt: verticals in compression; diagonals in tension)</w:t>
+        <w:t>Award full marks if: Top chord + verticals (red members). In Pratt trusses: top chord + verticals in compression; diagonals + bottom chord in tension.</w:t>
       </w:r>
     </w:p>
     <w:p>
@@ -457,7 +457,7 @@
           <w:i/>
           <w:sz w:val="20"/>
         </w:rPr>
-        <w:t>Prompt: Bridge A5 is the Sydney Harbour Bridge. Is this an ARCH, TRUSS, or HYBRID of both?</w:t>
+        <w:t>Prompt: Bridge A5 above is the Sydney Harbour Bridge. Circle ONE word: is this an ARCH, a TRUSS, or a HYBRID of both?</w:t>
       </w:r>
     </w:p>
     <w:p>
@@ -468,7 +468,7 @@
           <w:color w:val="9A3412"/>
           <w:sz w:val="20"/>
         </w:rPr>
-        <w:t>Award full marks if: Hybrid (steel arch WITH truss bracing inside)</w:t>
+        <w:t>Award full marks if: HYBRID (steel arch + truss bracing between the chords of the arch)</w:t>
       </w:r>
     </w:p>
     <w:p>
@@ -497,7 +497,7 @@
           <w:i/>
           <w:sz w:val="20"/>
         </w:rPr>
-        <w:t>Prompt: Which shape is STRONGEST and cannot be pushed out of shape without breaking a side? (circle one): square · triangle · ci...</w:t>
+        <w:t>Prompt: Look at the 5 shapes in A6 above. Which shape is STRONGEST in engineering — which one cannot be pushed out of shape with...</w:t>
       </w:r>
     </w:p>
     <w:p>
@@ -508,7 +508,7 @@
           <w:color w:val="9A3412"/>
           <w:sz w:val="20"/>
         </w:rPr>
-        <w:t>Award full marks if: Triangle</w:t>
+        <w:t>Award full marks if: TRIANGLE</w:t>
       </w:r>
     </w:p>
     <w:p>
@@ -537,7 +537,7 @@
           <w:i/>
           <w:sz w:val="20"/>
         </w:rPr>
-        <w:t>Prompt: Picture A7 shows a paper tower collapsing. What caused it to fall? (1 word): leaning / narrow-base / wind / gravity</w:t>
+        <w:t>Prompt: Picture A7 shows a paper tower falling over. What caused it to fall? Circle ONE: wide base · narrow base · strong walls ...</w:t>
       </w:r>
     </w:p>
     <w:p>
@@ -548,7 +548,7 @@
           <w:color w:val="9A3412"/>
           <w:sz w:val="20"/>
         </w:rPr>
-        <w:t>Award full marks if: Narrow-base (low stability — centre of gravity too high)</w:t>
+        <w:t>Award full marks if: NARROW BASE (low stability — high centre of gravity tipped the tower over)</w:t>
       </w:r>
     </w:p>
     <w:p>
@@ -577,7 +577,7 @@
           <w:i/>
           <w:sz w:val="20"/>
         </w:rPr>
-        <w:t>Prompt: Picture A8 shows 3 bridge shapes holding a book. In ONE sentence, which shape held the most weight?</w:t>
+        <w:t>Prompt: A8 above shows 3 shapes supporting a book. Which shape held the book BEST — A (flat), B (rolled tube), or C (concertina ...</w:t>
       </w:r>
     </w:p>
     <w:p>
@@ -588,7 +588,7 @@
           <w:color w:val="9A3412"/>
           <w:sz w:val="20"/>
         </w:rPr>
-        <w:t>Award full marks if: The rolled tube / cylinder (round shape distributes compression best)</w:t>
+        <w:t>Award full marks if: B — the ROLLED TUBE (the cylinder distributes compression around its walls; flat paper collapses immediately)</w:t>
       </w:r>
     </w:p>
     <w:p>

</xml_diff>